<commit_message>
fix(sessions): implement terminate_session endpoint and handler + update logbook start date to 15 Dec 2025
</commit_message>
<xml_diff>
--- a/PROJECT_DIARY_LOGBOOK_SECURESAFE_PAM.docx
+++ b/PROJECT_DIARY_LOGBOOK_SECURESAFE_PAM.docx
@@ -185,7 +185,7 @@
                 <w:b/>
                 <w:sz w:val="20"/>
               </w:rPr>
-              <w:t>Project Title:</w:t>
+              <w:t>Project Start Date:</w:t>
             </w:r>
           </w:p>
         </w:tc>
@@ -198,7 +198,7 @@
               <w:rPr>
                 <w:sz w:val="20"/>
               </w:rPr>
-              <w:t>SecureSafe Dynamic PAM System</w:t>
+              <w:t>December 15, 2025</w:t>
             </w:r>
           </w:p>
         </w:tc>
@@ -232,6 +232,35 @@
           </w:p>
         </w:tc>
       </w:tr>
+      <w:tr>
+        <w:tc>
+          <w:tcPr>
+            <w:tcW w:type="dxa" w:w="4680"/>
+          </w:tcPr>
+          <w:p>
+            <w:r>
+              <w:rPr>
+                <w:b/>
+                <w:sz w:val="20"/>
+              </w:rPr>
+              <w:t>Project Duration:</w:t>
+            </w:r>
+          </w:p>
+        </w:tc>
+        <w:tc>
+          <w:tcPr>
+            <w:tcW w:type="dxa" w:w="4680"/>
+          </w:tcPr>
+          <w:p>
+            <w:r>
+              <w:rPr>
+                <w:sz w:val="20"/>
+              </w:rPr>
+              <w:t>37 Weeks (Dec 2025 - Aug 2026)</w:t>
+            </w:r>
+          </w:p>
+        </w:tc>
+      </w:tr>
     </w:tbl>
     <w:p/>
     <w:p>
@@ -240,7 +269,7 @@
           <w:rFonts w:ascii="Calibri" w:hAnsi="Calibri"/>
           <w:b/>
           <w:color w:val="0F172A"/>
-          <w:sz w:val="30"/>
+          <w:sz w:val="28"/>
         </w:rPr>
         <w:t>1. Project Overview &amp; Scope</w:t>
       </w:r>
@@ -250,7 +279,7 @@
         <w:rPr>
           <w:sz w:val="20"/>
         </w:rPr>
-        <w:t>This project diary records the weekly progress, milestone achievements, technical challenges, supervisor consultations, and reflective evaluations undertaken during the design, development, and empirical testing of SecureSafe PAM—a dynamic, adaptive Privileged Access Management system integrating Google OAuth 2.0 delegated authentication with real-time machine learning-driven User Behavior Analytics (UEBA) and automated 3-strike token revocation.</w:t>
+        <w:t>This project diary records the weekly progress, milestone achievements, technical challenges, supervisor consultations, and reflective evaluations undertaken during the design, development, and empirical testing of SecureSafe PAM from December 15, 2025 to August 31, 2026.</w:t>
       </w:r>
     </w:p>
     <w:p>
@@ -259,7 +288,7 @@
           <w:rFonts w:ascii="Calibri" w:hAnsi="Calibri"/>
           <w:b/>
           <w:color w:val="0F172A"/>
-          <w:sz w:val="30"/>
+          <w:sz w:val="28"/>
         </w:rPr>
         <w:t>2. Project Phases &amp; Milestone Execution</w:t>
       </w:r>
@@ -270,9 +299,9 @@
           <w:rFonts w:ascii="Calibri" w:hAnsi="Calibri"/>
           <w:b/>
           <w:color w:val="0891B2"/>
-          <w:sz w:val="24"/>
+          <w:sz w:val="23"/>
         </w:rPr>
-        <w:t>Phase 1: Research &amp; Proposal Defense (Nov 2024 - Jan 2025)</w:t>
+        <w:t>Phase 1: Research &amp; Proposal Defense (15 Dec 2025 - 18 Jan 2026)</w:t>
       </w:r>
     </w:p>
     <w:p>
@@ -289,9 +318,9 @@
           <w:rFonts w:ascii="Calibri" w:hAnsi="Calibri"/>
           <w:b/>
           <w:color w:val="0891B2"/>
-          <w:sz w:val="24"/>
+          <w:sz w:val="23"/>
         </w:rPr>
-        <w:t>Phase 2: Requirements Elicitation &amp; ML Modeling (Feb 2025 - Apr 2025)</w:t>
+        <w:t>Phase 2: Requirements Elicitation &amp; ML Modeling (19 Jan 2026 - 22 Mar 2026)</w:t>
       </w:r>
     </w:p>
     <w:p>
@@ -308,9 +337,9 @@
           <w:rFonts w:ascii="Calibri" w:hAnsi="Calibri"/>
           <w:b/>
           <w:color w:val="0891B2"/>
-          <w:sz w:val="24"/>
+          <w:sz w:val="23"/>
         </w:rPr>
-        <w:t>Phase 3: Implementation &amp; Component Integration (May 2025 - Jun 2025)</w:t>
+        <w:t>Phase 3: Implementation &amp; Component Integration (23 Mar 2026 - 31 May 2026)</w:t>
       </w:r>
     </w:p>
     <w:p>
@@ -327,9 +356,9 @@
           <w:rFonts w:ascii="Calibri" w:hAnsi="Calibri"/>
           <w:b/>
           <w:color w:val="0891B2"/>
-          <w:sz w:val="24"/>
+          <w:sz w:val="23"/>
         </w:rPr>
-        <w:t>Phase 4: Testing, Benchmarking &amp; Dissertation (Jul 2025 - Aug 2026)</w:t>
+        <w:t>Phase 4: Testing, Benchmarking &amp; Dissertation (01 Jun 2026 - 31 Aug 2026)</w:t>
       </w:r>
     </w:p>
     <w:p>
@@ -346,7 +375,7 @@
           <w:rFonts w:ascii="Calibri" w:hAnsi="Calibri"/>
           <w:b/>
           <w:color w:val="0F172A"/>
-          <w:sz w:val="30"/>
+          <w:sz w:val="28"/>
         </w:rPr>
         <w:t>3. Detailed Bi-Weekly / Sprint Activity Logs</w:t>
       </w:r>
@@ -357,9 +386,9 @@
           <w:rFonts w:ascii="Calibri" w:hAnsi="Calibri"/>
           <w:b/>
           <w:color w:val="0891B2"/>
-          <w:sz w:val="24"/>
+          <w:sz w:val="23"/>
         </w:rPr>
-        <w:t>Sprint 1 (Weeks 1-2: 04 Nov - 17 Nov 2024): Topic Selection &amp; Background Research</w:t>
+        <w:t>Sprint 1 (Weeks 1-2: 15 Dec - 28 Dec 2025): Topic Selection &amp; Background Research</w:t>
       </w:r>
     </w:p>
     <w:p>
@@ -367,7 +396,7 @@
         <w:rPr>
           <w:sz w:val="20"/>
         </w:rPr>
-        <w:t>Analyzed enterprise access control vulnerabilities and the Lanka Government Cloud breach. Met supervisor (12 Nov) to scope out unsupervised ML vs static PAM rules.</w:t>
+        <w:t>Analyzed enterprise access control vulnerabilities and the Lanka Government Cloud breach. Met supervisor (19 Dec) to scope out unsupervised ML vs static PAM rules.</w:t>
       </w:r>
     </w:p>
     <w:p>
@@ -376,9 +405,9 @@
           <w:rFonts w:ascii="Calibri" w:hAnsi="Calibri"/>
           <w:b/>
           <w:color w:val="0891B2"/>
-          <w:sz w:val="24"/>
+          <w:sz w:val="23"/>
         </w:rPr>
-        <w:t>Sprint 2 (Weeks 3-4: 18 Nov - 01 Dec 2024): Literature Review &amp; Comparative Analysis</w:t>
+        <w:t>Sprint 2 (Weeks 3-4: 29 Dec 2025 - 11 Jan 2026): Literature Review &amp; Proposal Preparation</w:t>
       </w:r>
     </w:p>
     <w:p>
@@ -386,7 +415,7 @@
         <w:rPr>
           <w:sz w:val="20"/>
         </w:rPr>
-        <w:t>Reviewed CyberArk, BeyondTrust, Delinea, and academic UEBA papers. Formulated Table 1 comparative gap matrix and research questions RQ1-RQ5.</w:t>
+        <w:t>Reviewed CyberArk, BeyondTrust, Delinea, and academic UEBA papers. Formulated Table 1 comparative gap matrix, research questions RQ1-RQ5, and finalized proposal draft.</w:t>
       </w:r>
     </w:p>
     <w:p>
@@ -395,28 +424,9 @@
           <w:rFonts w:ascii="Calibri" w:hAnsi="Calibri"/>
           <w:b/>
           <w:color w:val="0891B2"/>
-          <w:sz w:val="24"/>
+          <w:sz w:val="23"/>
         </w:rPr>
-        <w:t>Sprint 3 (Weeks 5-6: 02 Dec - 15 Dec 2024): Project Proposal Authoring</w:t>
-      </w:r>
-    </w:p>
-    <w:p>
-      <w:r>
-        <w:rPr>
-          <w:sz w:val="20"/>
-        </w:rPr>
-        <w:t>Prepared comprehensive proposal with Gantt chart, resource requirements, and risk mitigation strategies. Supervisor approved draft on 10 Dec 2024.</w:t>
-      </w:r>
-    </w:p>
-    <w:p>
-      <w:r>
-        <w:rPr>
-          <w:rFonts w:ascii="Calibri" w:hAnsi="Calibri"/>
-          <w:b/>
-          <w:color w:val="0891B2"/>
-          <w:sz w:val="24"/>
-        </w:rPr>
-        <w:t>Sprint 4 (Weeks 7-8: 16 Dec 2024 - 05 Jan 2025): Proposal Presentation Defense</w:t>
+        <w:t>Sprint 3 (Week 5: 12 Jan - 18 Jan 2026): Proposal Presentation Defense</w:t>
       </w:r>
     </w:p>
     <w:p>
@@ -433,9 +443,9 @@
           <w:rFonts w:ascii="Calibri" w:hAnsi="Calibri"/>
           <w:b/>
           <w:color w:val="0891B2"/>
-          <w:sz w:val="24"/>
+          <w:sz w:val="23"/>
         </w:rPr>
-        <w:t>Sprint 5 (Weeks 9-10: 06 Jan - 26 Jan 2025): Survey Instrument Design &amp; Pilot Testing</w:t>
+        <w:t>Sprint 4 (Weeks 6-7: 19 Jan - 01 Feb 2026): Survey Instrument Design &amp; Pilot Testing</w:t>
       </w:r>
     </w:p>
     <w:p>
@@ -452,9 +462,9 @@
           <w:rFonts w:ascii="Calibri" w:hAnsi="Calibri"/>
           <w:b/>
           <w:color w:val="0891B2"/>
-          <w:sz w:val="24"/>
+          <w:sz w:val="23"/>
         </w:rPr>
-        <w:t>Sprint 6 (Weeks 11-12: 27 Jan - 16 Feb 2025): Survey Distribution &amp; Data Collection</w:t>
+        <w:t>Sprint 5 (Weeks 8-10: 02 Feb - 22 Feb 2026): Survey Distribution &amp; Data Collection</w:t>
       </w:r>
     </w:p>
     <w:p>
@@ -471,9 +481,9 @@
           <w:rFonts w:ascii="Calibri" w:hAnsi="Calibri"/>
           <w:b/>
           <w:color w:val="0891B2"/>
-          <w:sz w:val="24"/>
+          <w:sz w:val="23"/>
         </w:rPr>
-        <w:t>Sprint 7 (Weeks 13-14: 17 Feb - 09 Mar 2025): Survey Statistical Analysis &amp; SRS Document</w:t>
+        <w:t>Sprint 6 (Weeks 11-12: 23 Feb - 08 Mar 2026): Survey Statistical Analysis &amp; SRS Document</w:t>
       </w:r>
     </w:p>
     <w:p>
@@ -490,9 +500,9 @@
           <w:rFonts w:ascii="Calibri" w:hAnsi="Calibri"/>
           <w:b/>
           <w:color w:val="0891B2"/>
-          <w:sz w:val="24"/>
+          <w:sz w:val="23"/>
         </w:rPr>
-        <w:t>Sprint 8 (Weeks 15-16: 10 Mar - 30 Mar 2025): Synthetic Telemetry Generator &amp; Feature Design</w:t>
+        <w:t>Sprint 7 (Weeks 13-14: 09 Mar - 22 Mar 2026): Synthetic Dataset &amp; Isolation Forest Training</w:t>
       </w:r>
     </w:p>
     <w:p>
@@ -500,7 +510,7 @@
         <w:rPr>
           <w:sz w:val="20"/>
         </w:rPr>
-        <w:t>Engineered synthetic log pipeline modeling MITRE ATT&amp;CK patterns across 4 features: hour, ip_is_local, action_type, user_role (1,555 benchmark samples).</w:t>
+        <w:t>Engineered synthetic log pipeline modeling MITRE ATT&amp;CK patterns across 4 features (1,555 benchmark samples). Trained Isolation Forest with OneHotEncoder (87.3% accuracy).</w:t>
       </w:r>
     </w:p>
     <w:p>
@@ -509,28 +519,9 @@
           <w:rFonts w:ascii="Calibri" w:hAnsi="Calibri"/>
           <w:b/>
           <w:color w:val="0891B2"/>
-          <w:sz w:val="24"/>
+          <w:sz w:val="23"/>
         </w:rPr>
-        <w:t>Sprint 9 (Weeks 17-18: 31 Mar - 20 Apr 2025): Isolation Forest Model Training &amp; Tuning</w:t>
-      </w:r>
-    </w:p>
-    <w:p>
-      <w:r>
-        <w:rPr>
-          <w:sz w:val="20"/>
-        </w:rPr>
-        <w:t>Trained Isolation Forest with OneHotEncoder in Python. Tuned contamination factor (0.05). Serialized risk_model.joblib and encoder.joblib.</w:t>
-      </w:r>
-    </w:p>
-    <w:p>
-      <w:r>
-        <w:rPr>
-          <w:rFonts w:ascii="Calibri" w:hAnsi="Calibri"/>
-          <w:b/>
-          <w:color w:val="0891B2"/>
-          <w:sz w:val="24"/>
-        </w:rPr>
-        <w:t>Sprint 10 (Weeks 19-20: 21 Apr - 11 May 2025): Authentication Module &amp; RBAC Engine</w:t>
+        <w:t>Sprint 8 (Weeks 15-17: 23 Mar - 12 Apr 2026): Authentication Module &amp; RBAC Engine</w:t>
       </w:r>
     </w:p>
     <w:p>
@@ -547,9 +538,9 @@
           <w:rFonts w:ascii="Calibri" w:hAnsi="Calibri"/>
           <w:b/>
           <w:color w:val="0891B2"/>
-          <w:sz w:val="24"/>
+          <w:sz w:val="23"/>
         </w:rPr>
-        <w:t>Sprint 11 (Weeks 21-22: 12 May - 01 Jun 2025): Dynamic 3-Strike Controller &amp; Log Watcher</w:t>
+        <w:t>Sprint 9 (Weeks 18-20: 13 Apr - 03 May 2026): Dynamic 3-Strike Controller &amp; Log Watcher</w:t>
       </w:r>
     </w:p>
     <w:p>
@@ -566,9 +557,9 @@
           <w:rFonts w:ascii="Calibri" w:hAnsi="Calibri"/>
           <w:b/>
           <w:color w:val="0891B2"/>
-          <w:sz w:val="24"/>
+          <w:sz w:val="23"/>
         </w:rPr>
-        <w:t>Sprint 12 (Weeks 23-24: 02 Jun - 22 Jun 2025): User Onboarding &amp; SMTP Email Engine</w:t>
+        <w:t>Sprint 10 (Weeks 21-22: 04 May - 17 May 2026): User Onboarding &amp; SMTP Email Engine</w:t>
       </w:r>
     </w:p>
     <w:p>
@@ -585,9 +576,9 @@
           <w:rFonts w:ascii="Calibri" w:hAnsi="Calibri"/>
           <w:b/>
           <w:color w:val="0891B2"/>
-          <w:sz w:val="24"/>
+          <w:sz w:val="23"/>
         </w:rPr>
-        <w:t>Sprint 13 (Weeks 25-26: 23 Jun - 13 Jul 2025): SPA Dashboard, Threat Simulator &amp; Excel Report</w:t>
+        <w:t>Sprint 11 (Weeks 23-24: 18 May - 31 May 2026): SPA Dashboard, Threat Simulator &amp; Excel Report</w:t>
       </w:r>
     </w:p>
     <w:p>
@@ -604,9 +595,9 @@
           <w:rFonts w:ascii="Calibri" w:hAnsi="Calibri"/>
           <w:b/>
           <w:color w:val="0891B2"/>
-          <w:sz w:val="24"/>
+          <w:sz w:val="23"/>
         </w:rPr>
-        <w:t>Sprint 14 (Weeks 27-28: 14 Jul - 03 Aug 2025): Automated Unit &amp; Integration Testing</w:t>
+        <w:t>Sprint 12 (Weeks 25-27: 01 Jun - 21 Jun 2026): Automated Unit &amp; Integration Testing</w:t>
       </w:r>
     </w:p>
     <w:p>
@@ -623,9 +614,9 @@
           <w:rFonts w:ascii="Calibri" w:hAnsi="Calibri"/>
           <w:b/>
           <w:color w:val="0891B2"/>
-          <w:sz w:val="24"/>
+          <w:sz w:val="23"/>
         </w:rPr>
-        <w:t>Sprint 15 (Weeks 29-30: 04 Aug - 17 Aug 2025): Model Benchmarking &amp; Performance Analysis</w:t>
+        <w:t>Sprint 13 (Weeks 28-30: 22 Jun - 12 Jul 2026): Model Benchmarking &amp; Performance Analysis</w:t>
       </w:r>
     </w:p>
     <w:p>
@@ -642,9 +633,9 @@
           <w:rFonts w:ascii="Calibri" w:hAnsi="Calibri"/>
           <w:b/>
           <w:color w:val="0891B2"/>
-          <w:sz w:val="24"/>
+          <w:sz w:val="23"/>
         </w:rPr>
-        <w:t>Sprint 16 (Weeks 31-32: 18 Aug 2025 - 24 Aug 2026): Academic Dissertation Writing (Chapters 1-8)</w:t>
+        <w:t>Sprint 14 (Weeks 31-34: 13 Jul - 09 Aug 2026): Academic Dissertation Writing (Chapters 1-8)</w:t>
       </w:r>
     </w:p>
     <w:p>
@@ -661,9 +652,9 @@
           <w:rFonts w:ascii="Calibri" w:hAnsi="Calibri"/>
           <w:b/>
           <w:color w:val="0891B2"/>
-          <w:sz w:val="24"/>
+          <w:sz w:val="23"/>
         </w:rPr>
-        <w:t>Sprint 17 (Weeks 33-34: 25 Aug - 31 Aug 2026): Final Submission Packaging &amp; Viva Preparation</w:t>
+        <w:t>Sprint 15 (Weeks 35-37: 10 Aug - 31 Aug 2026): Final Submission Packaging &amp; Viva Preparation</w:t>
       </w:r>
     </w:p>
     <w:p>
@@ -671,7 +662,7 @@
         <w:rPr>
           <w:sz w:val="20"/>
         </w:rPr>
-        <w:t>Compiled source code deployment bundle, experiment logs package, presentation slide deck, and finalized project logbook for upload.</w:t>
+        <w:t>Compiled source code deployment bundle, experiment logs package, 26-slide presentation deck, and finalized project logbook for upload.</w:t>
       </w:r>
     </w:p>
     <w:p>
@@ -680,7 +671,7 @@
           <w:rFonts w:ascii="Calibri" w:hAnsi="Calibri"/>
           <w:b/>
           <w:color w:val="0F172A"/>
-          <w:sz w:val="30"/>
+          <w:sz w:val="28"/>
         </w:rPr>
         <w:t>4. Supervisor Consultation Log</w:t>
       </w:r>
@@ -786,7 +777,7 @@
               <w:rPr>
                 <w:sz w:val="18"/>
               </w:rPr>
-              <w:t>12 Nov 2024</w:t>
+              <w:t>19 Dec 2025</w:t>
             </w:r>
           </w:p>
         </w:tc>
@@ -840,7 +831,7 @@
               <w:rPr>
                 <w:sz w:val="18"/>
               </w:rPr>
-              <w:t>26 Nov 2024</w:t>
+              <w:t>06 Jan 2026</w:t>
             </w:r>
           </w:p>
         </w:tc>
@@ -894,7 +885,7 @@
               <w:rPr>
                 <w:sz w:val="18"/>
               </w:rPr>
-              <w:t>10 Dec 2024</w:t>
+              <w:t>27 Jan 2026</w:t>
             </w:r>
           </w:p>
         </w:tc>
@@ -907,7 +898,7 @@
               <w:rPr>
                 <w:sz w:val="18"/>
               </w:rPr>
-              <w:t>Project proposal review, research objectives, Gantt chart</w:t>
+              <w:t>Survey questionnaire design, ethical clearance, target sample</w:t>
             </w:r>
           </w:p>
         </w:tc>
@@ -948,7 +939,7 @@
               <w:rPr>
                 <w:sz w:val="18"/>
               </w:rPr>
-              <w:t>21 Jan 2025</w:t>
+              <w:t>03 Mar 2026</w:t>
             </w:r>
           </w:p>
         </w:tc>
@@ -961,7 +952,7 @@
               <w:rPr>
                 <w:sz w:val="18"/>
               </w:rPr>
-              <w:t>Survey questionnaire design, ethical clearance, target sample</w:t>
+              <w:t>Survey data analysis (115 respondents), SRS formulation</w:t>
             </w:r>
           </w:p>
         </w:tc>
@@ -1002,7 +993,7 @@
               <w:rPr>
                 <w:sz w:val="18"/>
               </w:rPr>
-              <w:t>04 Mar 2025</w:t>
+              <w:t>17 Mar 2026</w:t>
             </w:r>
           </w:p>
         </w:tc>
@@ -1015,7 +1006,7 @@
               <w:rPr>
                 <w:sz w:val="18"/>
               </w:rPr>
-              <w:t>Survey data analysis (115 respondents), SRS formulation</w:t>
+              <w:t>Isolation Forest model training, feature selection, heuristics</w:t>
             </w:r>
           </w:p>
         </w:tc>
@@ -1056,7 +1047,7 @@
               <w:rPr>
                 <w:sz w:val="18"/>
               </w:rPr>
-              <w:t>15 Apr 2025</w:t>
+              <w:t>28 Apr 2026</w:t>
             </w:r>
           </w:p>
         </w:tc>
@@ -1069,7 +1060,7 @@
               <w:rPr>
                 <w:sz w:val="18"/>
               </w:rPr>
-              <w:t>Isolation Forest model training, feature selection, heuristics</w:t>
+              <w:t>OAuth 2.0 integration, dynamic revocation controller demo</w:t>
             </w:r>
           </w:p>
         </w:tc>
@@ -1110,7 +1101,7 @@
               <w:rPr>
                 <w:sz w:val="18"/>
               </w:rPr>
-              <w:t>27 May 2025</w:t>
+              <w:t>26 May 2026</w:t>
             </w:r>
           </w:p>
         </w:tc>
@@ -1123,7 +1114,7 @@
               <w:rPr>
                 <w:sz w:val="18"/>
               </w:rPr>
-              <w:t>OAuth 2.0 integration, dynamic revocation controller demo</w:t>
+              <w:t>SPA dashboard, simulator scenarios, Excel report generation</w:t>
             </w:r>
           </w:p>
         </w:tc>
@@ -1164,7 +1155,7 @@
               <w:rPr>
                 <w:sz w:val="18"/>
               </w:rPr>
-              <w:t>08 Jul 2025</w:t>
+              <w:t>07 Jul 2026</w:t>
             </w:r>
           </w:p>
         </w:tc>
@@ -1177,7 +1168,7 @@
               <w:rPr>
                 <w:sz w:val="18"/>
               </w:rPr>
-              <w:t>SPA dashboard, simulator scenarios, Excel report generation</w:t>
+              <w:t>Benchmark evaluation results (1,555 samples), ROC curves</w:t>
             </w:r>
           </w:p>
         </w:tc>
@@ -1218,61 +1209,7 @@
               <w:rPr>
                 <w:sz w:val="18"/>
               </w:rPr>
-              <w:t>12 Aug 2025</w:t>
-            </w:r>
-          </w:p>
-        </w:tc>
-        <w:tc>
-          <w:tcPr>
-            <w:tcW w:type="dxa" w:w="2340"/>
-          </w:tcPr>
-          <w:p>
-            <w:r>
-              <w:rPr>
-                <w:sz w:val="18"/>
-              </w:rPr>
-              <w:t>Benchmark evaluation results (1,555 samples), ROC curves</w:t>
-            </w:r>
-          </w:p>
-        </w:tc>
-        <w:tc>
-          <w:tcPr>
-            <w:tcW w:type="dxa" w:w="2340"/>
-          </w:tcPr>
-          <w:p>
-            <w:r>
-              <w:rPr>
-                <w:sz w:val="18"/>
-              </w:rPr>
-              <w:t>Approved</w:t>
-            </w:r>
-          </w:p>
-        </w:tc>
-      </w:tr>
-      <w:tr>
-        <w:tc>
-          <w:tcPr>
-            <w:tcW w:type="dxa" w:w="2340"/>
-          </w:tcPr>
-          <w:p>
-            <w:r>
-              <w:rPr>
-                <w:sz w:val="18"/>
-              </w:rPr>
-              <w:t>10</w:t>
-            </w:r>
-          </w:p>
-        </w:tc>
-        <w:tc>
-          <w:tcPr>
-            <w:tcW w:type="dxa" w:w="2340"/>
-          </w:tcPr>
-          <w:p>
-            <w:r>
-              <w:rPr>
-                <w:sz w:val="18"/>
-              </w:rPr>
-              <w:t>22 Aug 2026</w:t>
+              <w:t>04 Aug 2026</w:t>
             </w:r>
           </w:p>
         </w:tc>
@@ -1313,7 +1250,7 @@
               <w:rPr>
                 <w:sz w:val="18"/>
               </w:rPr>
-              <w:t>11</w:t>
+              <w:t>10</w:t>
             </w:r>
           </w:p>
         </w:tc>
@@ -1365,7 +1302,7 @@
           <w:rFonts w:ascii="Calibri" w:hAnsi="Calibri"/>
           <w:b/>
           <w:color w:val="0F172A"/>
-          <w:sz w:val="30"/>
+          <w:sz w:val="28"/>
         </w:rPr>
         <w:t>5. Final Academic Declaration &amp; Sign-Off</w:t>
       </w:r>

</xml_diff>